<commit_message>
Update proto-persona, user stories, entre outros
</commit_message>
<xml_diff>
--- a/Sprint 2/Dicionário de Dados/Dicionário De Dados - Safety Intelligence - Sprint 2.docx
+++ b/Sprint 2/Dicionário de Dados/Dicionário De Dados - Safety Intelligence - Sprint 2.docx
@@ -502,22 +502,18 @@
                             <w:pPr>
                               <w:ind w:right="1261"/>
                             </w:pPr>
-                            <w:proofErr w:type="spellStart"/>
-                            <w:proofErr w:type="gramStart"/>
                             <w:r>
                               <w:rPr>
                                 <w:rFonts w:ascii="Arial Nova" w:hAnsi="Arial Nova"/>
                               </w:rPr>
-                              <w:t>Imobiliaria</w:t>
+                              <w:t>Imobiliária</w:t>
                             </w:r>
-                            <w:proofErr w:type="spellEnd"/>
                             <w:r>
                               <w:rPr>
                                 <w:rFonts w:ascii="Arial Nova" w:hAnsi="Arial Nova"/>
                               </w:rPr>
-                              <w:t>(</w:t>
+                              <w:t xml:space="preserve"> (</w:t>
                             </w:r>
-                            <w:proofErr w:type="gramEnd"/>
                             <w:r>
                               <w:rPr>
                                 <w:rFonts w:ascii="Arial Nova" w:hAnsi="Arial Nova"/>
@@ -545,9 +541,9 @@
               </wp:anchor>
             </w:drawing>
           </mc:Choice>
-          <mc:Fallback xmlns:a="http://schemas.openxmlformats.org/drawingml/2006/main">
+          <mc:Fallback>
             <w:pict>
-              <v:rect id="Retângulo 1" style="position:absolute;left:0;text-align:left;margin-left:-74.2pt;margin-top:55.45pt;width:180.65pt;height:205.75pt;z-index:251633152;visibility:visible;mso-wrap-style:square;mso-width-percent:0;mso-height-percent:0;mso-wrap-distance-left:9pt;mso-wrap-distance-top:0;mso-wrap-distance-right:9pt;mso-wrap-distance-bottom:0;mso-position-horizontal:absolute;mso-position-horizontal-relative:margin;mso-position-vertical:absolute;mso-position-vertical-relative:text;mso-width-percent:0;mso-height-percent:0;mso-width-relative:margin;mso-height-relative:margin;v-text-anchor:top" o:spid="_x0000_s1027" fillcolor="#0a4f8e" strokecolor="#030e13 [484]" strokeweight="1.5pt" w14:anchorId="3B8F4862" o:gfxdata="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">
+              <v:rect w14:anchorId="3B8F4862" id="Retângulo 1" o:spid="_x0000_s1027" style="position:absolute;left:0;text-align:left;margin-left:-74.2pt;margin-top:55.45pt;width:180.65pt;height:205.75pt;z-index:251633152;visibility:visible;mso-wrap-style:square;mso-width-percent:0;mso-height-percent:0;mso-wrap-distance-left:9pt;mso-wrap-distance-top:0;mso-wrap-distance-right:9pt;mso-wrap-distance-bottom:0;mso-position-horizontal:absolute;mso-position-horizontal-relative:margin;mso-position-vertical:absolute;mso-position-vertical-relative:text;mso-width-percent:0;mso-height-percent:0;mso-width-relative:margin;mso-height-relative:margin;v-text-anchor:top" o:gfxdata="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" fillcolor="#0a4f8e" strokecolor="#030e13 [484]" strokeweight="1.5pt">
                 <v:textbox>
                   <w:txbxContent>
                     <w:p>
@@ -588,22 +584,18 @@
                       <w:pPr>
                         <w:ind w:right="1261"/>
                       </w:pPr>
-                      <w:proofErr w:type="spellStart"/>
-                      <w:proofErr w:type="gramStart"/>
                       <w:r>
                         <w:rPr>
                           <w:rFonts w:ascii="Arial Nova" w:hAnsi="Arial Nova"/>
                         </w:rPr>
-                        <w:t>Imobiliaria</w:t>
+                        <w:t>Imobiliária</w:t>
                       </w:r>
-                      <w:proofErr w:type="spellEnd"/>
                       <w:r>
                         <w:rPr>
                           <w:rFonts w:ascii="Arial Nova" w:hAnsi="Arial Nova"/>
                         </w:rPr>
-                        <w:t>(</w:t>
+                        <w:t xml:space="preserve"> (</w:t>
                       </w:r>
-                      <w:proofErr w:type="gramEnd"/>
                       <w:r>
                         <w:rPr>
                           <w:rFonts w:ascii="Arial Nova" w:hAnsi="Arial Nova"/>
@@ -4541,12 +4533,14 @@
 </file>
 
 <file path=customXml/item1.xml><?xml version="1.0" encoding="utf-8"?>
-<?mso-contentType ?>
-<FormTemplates xmlns="http://schemas.microsoft.com/sharepoint/v3/contenttype/forms">
-  <Display>DocumentLibraryForm</Display>
-  <Edit>DocumentLibraryForm</Edit>
-  <New>DocumentLibraryForm</New>
-</FormTemplates>
+<p:properties xmlns:p="http://schemas.microsoft.com/office/2006/metadata/properties" xmlns:xsi="http://www.w3.org/2001/XMLSchema-instance" xmlns:pc="http://schemas.microsoft.com/office/infopath/2007/PartnerControls">
+  <documentManagement>
+    <lcf76f155ced4ddcb4097134ff3c332f xmlns="90121372-7411-44e9-a0b4-d98e677814c9">
+      <Terms xmlns="http://schemas.microsoft.com/office/infopath/2007/PartnerControls"/>
+    </lcf76f155ced4ddcb4097134ff3c332f>
+    <TaxCatchAll xmlns="c5531305-e480-42b6-a1a7-544f1160e8db" xsi:nil="true"/>
+  </documentManagement>
+</p:properties>
 </file>
 
 <file path=customXml/item2.xml><?xml version="1.0" encoding="utf-8"?>
@@ -4739,20 +4733,21 @@
 </file>
 
 <file path=customXml/item3.xml><?xml version="1.0" encoding="utf-8"?>
-<p:properties xmlns:p="http://schemas.microsoft.com/office/2006/metadata/properties" xmlns:xsi="http://www.w3.org/2001/XMLSchema-instance" xmlns:pc="http://schemas.microsoft.com/office/infopath/2007/PartnerControls">
-  <documentManagement>
-    <lcf76f155ced4ddcb4097134ff3c332f xmlns="90121372-7411-44e9-a0b4-d98e677814c9">
-      <Terms xmlns="http://schemas.microsoft.com/office/infopath/2007/PartnerControls"/>
-    </lcf76f155ced4ddcb4097134ff3c332f>
-    <TaxCatchAll xmlns="c5531305-e480-42b6-a1a7-544f1160e8db" xsi:nil="true"/>
-  </documentManagement>
-</p:properties>
+<?mso-contentType ?>
+<FormTemplates xmlns="http://schemas.microsoft.com/sharepoint/v3/contenttype/forms">
+  <Display>DocumentLibraryForm</Display>
+  <Edit>DocumentLibraryForm</Edit>
+  <New>DocumentLibraryForm</New>
+</FormTemplates>
 </file>
 
 <file path=customXml/itemProps1.xml><?xml version="1.0" encoding="utf-8"?>
-<ds:datastoreItem xmlns:ds="http://schemas.openxmlformats.org/officeDocument/2006/customXml" ds:itemID="{AB45ACD9-F65A-4915-8468-A36CAC1C4537}">
+<ds:datastoreItem xmlns:ds="http://schemas.openxmlformats.org/officeDocument/2006/customXml" ds:itemID="{C9B02842-BC88-48D9-950D-A031C90D3EB6}">
   <ds:schemaRefs>
-    <ds:schemaRef ds:uri="http://schemas.microsoft.com/sharepoint/v3/contenttype/forms"/>
+    <ds:schemaRef ds:uri="http://schemas.microsoft.com/office/2006/metadata/properties"/>
+    <ds:schemaRef ds:uri="http://schemas.microsoft.com/office/infopath/2007/PartnerControls"/>
+    <ds:schemaRef ds:uri="90121372-7411-44e9-a0b4-d98e677814c9"/>
+    <ds:schemaRef ds:uri="c5531305-e480-42b6-a1a7-544f1160e8db"/>
   </ds:schemaRefs>
 </ds:datastoreItem>
 </file>
@@ -4777,12 +4772,9 @@
 </file>
 
 <file path=customXml/itemProps3.xml><?xml version="1.0" encoding="utf-8"?>
-<ds:datastoreItem xmlns:ds="http://schemas.openxmlformats.org/officeDocument/2006/customXml" ds:itemID="{C9B02842-BC88-48D9-950D-A031C90D3EB6}">
+<ds:datastoreItem xmlns:ds="http://schemas.openxmlformats.org/officeDocument/2006/customXml" ds:itemID="{AB45ACD9-F65A-4915-8468-A36CAC1C4537}">
   <ds:schemaRefs>
-    <ds:schemaRef ds:uri="http://schemas.microsoft.com/office/2006/metadata/properties"/>
-    <ds:schemaRef ds:uri="http://schemas.microsoft.com/office/infopath/2007/PartnerControls"/>
-    <ds:schemaRef ds:uri="90121372-7411-44e9-a0b4-d98e677814c9"/>
-    <ds:schemaRef ds:uri="c5531305-e480-42b6-a1a7-544f1160e8db"/>
+    <ds:schemaRef ds:uri="http://schemas.microsoft.com/sharepoint/v3/contenttype/forms"/>
   </ds:schemaRefs>
 </ds:datastoreItem>
 </file>
</xml_diff>